<commit_message>
record phase 1 consensus updates
</commit_message>
<xml_diff>
--- a/data/04_extraction/coder_packages/R2/construct_harmonization.docx
+++ b/data/04_extraction/coder_packages/R2/construct_harmonization.docx
@@ -3240,7 +3240,7 @@
       </w:pPr>
       <w:sdt>
         <w:sdtPr>
-          <w:id w:val="242648139"/>
+          <w:id w:val="1143793573"/>
           <w:tag w:val="goog_rdk_0"/>
         </w:sdtPr>
         <w:sdtContent>
@@ -3269,7 +3269,7 @@
       </w:pPr>
       <w:sdt>
         <w:sdtPr>
-          <w:id w:val="-1514962997"/>
+          <w:id w:val="2086878969"/>
           <w:tag w:val="goog_rdk_1"/>
         </w:sdtPr>
         <w:sdtContent>
@@ -3298,7 +3298,7 @@
       </w:pPr>
       <w:sdt>
         <w:sdtPr>
-          <w:id w:val="57733371"/>
+          <w:id w:val="-2009498836"/>
           <w:tag w:val="goog_rdk_2"/>
         </w:sdtPr>
         <w:sdtContent>
@@ -3651,7 +3651,7 @@
       </w:pPr>
       <w:sdt>
         <w:sdtPr>
-          <w:id w:val="-1375994327"/>
+          <w:id w:val="-956205247"/>
           <w:tag w:val="goog_rdk_3"/>
         </w:sdtPr>
         <w:sdtContent>
@@ -3680,7 +3680,7 @@
       </w:pPr>
       <w:sdt>
         <w:sdtPr>
-          <w:id w:val="1379510576"/>
+          <w:id w:val="-93056731"/>
           <w:tag w:val="goog_rdk_4"/>
         </w:sdtPr>
         <w:sdtContent>
@@ -3709,7 +3709,7 @@
       </w:pPr>
       <w:sdt>
         <w:sdtPr>
-          <w:id w:val="-1715241267"/>
+          <w:id w:val="1542181517"/>
           <w:tag w:val="goog_rdk_5"/>
         </w:sdtPr>
         <w:sdtContent>
@@ -3987,7 +3987,7 @@
       </w:pPr>
       <w:sdt>
         <w:sdtPr>
-          <w:id w:val="-1397899240"/>
+          <w:id w:val="902815275"/>
           <w:tag w:val="goog_rdk_6"/>
         </w:sdtPr>
         <w:sdtContent>
@@ -4016,7 +4016,7 @@
       </w:pPr>
       <w:sdt>
         <w:sdtPr>
-          <w:id w:val="524100523"/>
+          <w:id w:val="-1122049476"/>
           <w:tag w:val="goog_rdk_7"/>
         </w:sdtPr>
         <w:sdtContent>
@@ -4045,7 +4045,7 @@
       </w:pPr>
       <w:sdt>
         <w:sdtPr>
-          <w:id w:val="-1595568719"/>
+          <w:id w:val="-1049814765"/>
           <w:tag w:val="goog_rdk_8"/>
         </w:sdtPr>
         <w:sdtContent>
@@ -4446,7 +4446,7 @@
       </w:pPr>
       <w:sdt>
         <w:sdtPr>
-          <w:id w:val="-1634919425"/>
+          <w:id w:val="1951979490"/>
           <w:tag w:val="goog_rdk_9"/>
         </w:sdtPr>
         <w:sdtContent>
@@ -4475,7 +4475,7 @@
       </w:pPr>
       <w:sdt>
         <w:sdtPr>
-          <w:id w:val="-1793084760"/>
+          <w:id w:val="1762940672"/>
           <w:tag w:val="goog_rdk_10"/>
         </w:sdtPr>
         <w:sdtContent>
@@ -4504,7 +4504,7 @@
       </w:pPr>
       <w:sdt>
         <w:sdtPr>
-          <w:id w:val="-85267577"/>
+          <w:id w:val="1791949551"/>
           <w:tag w:val="goog_rdk_11"/>
         </w:sdtPr>
         <w:sdtContent>
@@ -5768,7 +5768,7 @@
       </w:pPr>
       <w:sdt>
         <w:sdtPr>
-          <w:id w:val="286125709"/>
+          <w:id w:val="-1264141347"/>
           <w:tag w:val="goog_rdk_12"/>
         </w:sdtPr>
         <w:sdtContent>
@@ -5797,7 +5797,7 @@
       </w:pPr>
       <w:sdt>
         <w:sdtPr>
-          <w:id w:val="-85630713"/>
+          <w:id w:val="-1148305881"/>
           <w:tag w:val="goog_rdk_13"/>
         </w:sdtPr>
         <w:sdtContent>
@@ -5826,7 +5826,7 @@
       </w:pPr>
       <w:sdt>
         <w:sdtPr>
-          <w:id w:val="2093699822"/>
+          <w:id w:val="1463087062"/>
           <w:tag w:val="goog_rdk_14"/>
         </w:sdtPr>
         <w:sdtContent>
@@ -6206,7 +6206,7 @@
             </w:pPr>
             <w:sdt>
               <w:sdtPr>
-                <w:id w:val="15461625"/>
+                <w:id w:val="1426854873"/>
                 <w:tag w:val="goog_rdk_15"/>
               </w:sdtPr>
               <w:sdtContent>
@@ -6289,7 +6289,7 @@
             </w:pPr>
             <w:sdt>
               <w:sdtPr>
-                <w:id w:val="36220112"/>
+                <w:id w:val="-216395082"/>
                 <w:tag w:val="goog_rdk_16"/>
               </w:sdtPr>
               <w:sdtContent>
@@ -7737,7 +7737,7 @@
       </w:pPr>
       <w:sdt>
         <w:sdtPr>
-          <w:id w:val="793268912"/>
+          <w:id w:val="-651571973"/>
           <w:tag w:val="goog_rdk_17"/>
         </w:sdtPr>
         <w:sdtContent>
@@ -9552,7 +9552,7 @@
       </w:pPr>
       <w:sdt>
         <w:sdtPr>
-          <w:id w:val="-1703593707"/>
+          <w:id w:val="-325641031"/>
           <w:tag w:val="goog_rdk_18"/>
         </w:sdtPr>
         <w:sdtContent>
@@ -12928,7 +12928,7 @@
       </w:pPr>
       <w:sdt>
         <w:sdtPr>
-          <w:id w:val="502195096"/>
+          <w:id w:val="742267174"/>
           <w:tag w:val="goog_rdk_19"/>
         </w:sdtPr>
         <w:sdtContent>

</xml_diff>